<commit_message>
feat: download button + fix template author + UUID-based download
- Backend: download by UUID (/download/{id}), store files in UUID folders
- Frontend: download button downloads each success file separately
- Templates: removed "Van Cu" text, set author to "Navigos Search"

Co-Authored-By: Claude Sonnet 4.6 <noreply@anthropic.com>
</commit_message>
<xml_diff>
--- a/backend/templates/Form EN 2024.docx
+++ b/backend/templates/Form EN 2024.docx
@@ -287,16 +287,7 @@
           <w:szCs w:val="36"/>
         </w:rPr>
       </w:pPr>
-      <w:r>
-        <w:rPr>
-          <w:rFonts w:asciiTheme="majorHAnsi" w:hAnsiTheme="majorHAnsi" w:cstheme="majorHAnsi"/>
-          <w:b/>
-          <w:color w:val="E46F21" w:themeColor="accent2"/>
-          <w:sz w:val="36"/>
-          <w:szCs w:val="36"/>
-        </w:rPr>
-        <w:t>Navigos Search’s Assessment</w:t>
-      </w:r>
+      <w:r/>
     </w:p>
     <w:p>
       <w:pPr>

</xml_diff>